<commit_message>
Add Approved Material Studio (French), source corrections, strict marking, guide updates
Co-Authored-By: Claude Sonnet 5.5 <noreply@anthropic.com>
Claude-Session: https://claude.ai/code/session_01S5rYTdm2Guhk5rucFAEyLg
</commit_message>
<xml_diff>
--- a/Word documents/AP IGCSE French Approved Material.docx
+++ b/Word documents/AP IGCSE French Approved Material.docx
@@ -6215,7 +6215,7 @@
         <w:spacing w:after="60"/>
       </w:pPr>
       <w:r>
-        <w:t xml:space="preserve">Le soir, je voudrais dîner dans des trattorias locales, en profitant des pâtes fraîches et des bons vins italiens.</w:t>
+        <w:t xml:space="preserve">Le soir, je voudrais dîner dans des trattorias locales, en profitant des pâtes fraîches et de bons vins italiens.</w:t>
       </w:r>
     </w:p>
     <w:p>
@@ -8759,7 +8759,7 @@
         <w:spacing w:after="60"/>
       </w:pPr>
       <w:r>
-        <w:t xml:space="preserve">Pour les pantalons, je cherche une taille 34 en longueur et 32 en tour de taille, est-ce que vous avez cette taille en stock ?</w:t>
+        <w:t xml:space="preserve">Pour les pantalons, je cherche une taille 34 en longueur et 32 en tour de taille. Est-ce que vous avez cette taille en stock ?</w:t>
       </w:r>
     </w:p>
     <w:p>

</xml_diff>

<commit_message>
French questions use vous; Points to cover line for all 149 topics; guides updated
Co-Authored-By: Claude Sonnet 5.5 <noreply@anthropic.com>
Claude-Session: https://claude.ai/code/session_01S5rYTdm2Guhk5rucFAEyLg
</commit_message>
<xml_diff>
--- a/Word documents/AP IGCSE French Approved Material.docx
+++ b/Word documents/AP IGCSE French Approved Material.docx
@@ -60,7 +60,7 @@
           <w:b/>
           <w:bCs/>
         </w:rPr>
-        <w:t xml:space="preserve">Décris une journée typique en mentionnant ton emploi du temps scolaire</w:t>
+        <w:t>Décrivez une journée typique en mentionnant votre emploi du temps scolaire</w:t>
       </w:r>
     </w:p>
     <w:p>
@@ -143,7 +143,7 @@
           <w:b/>
           <w:bCs/>
         </w:rPr>
-        <w:t xml:space="preserve">Compare les routines des jours de semaine et des week-ends</w:t>
+        <w:t>Comparez les routines des jours de semaine et des week-ends</w:t>
       </w:r>
     </w:p>
     <w:p>
@@ -213,7 +213,7 @@
           <w:b/>
           <w:bCs/>
         </w:rPr>
-        <w:t xml:space="preserve">Donne des informations sur ton anniversaire, y compris l'année, et parle d'une fête mémorable</w:t>
+        <w:t>Donnez des informations sur votre anniversaire, y compris l'année, et parlez d'une fête mémorable</w:t>
       </w:r>
     </w:p>
     <w:p>
@@ -283,7 +283,7 @@
           <w:b/>
           <w:bCs/>
         </w:rPr>
-        <w:t xml:space="preserve">Quel est ton mois préféré et pourquoi ?</w:t>
+        <w:t>Quel est votre mois préféré et pourquoi ?</w:t>
       </w:r>
     </w:p>
     <w:p>
@@ -353,7 +353,7 @@
           <w:b/>
           <w:bCs/>
         </w:rPr>
-        <w:t xml:space="preserve">Quelle est ta saison préférée et pourquoi ?</w:t>
+        <w:t>Quelle est votre saison préférée et pourquoi ?</w:t>
       </w:r>
     </w:p>
     <w:p>
@@ -423,7 +423,7 @@
           <w:b/>
           <w:bCs/>
         </w:rPr>
-        <w:t xml:space="preserve">Qu'as-tu fait le week-end dernier ?</w:t>
+        <w:t>Qu'avez-vous fait le week-end dernier ?</w:t>
       </w:r>
     </w:p>
     <w:p>
@@ -493,7 +493,7 @@
           <w:b/>
           <w:bCs/>
         </w:rPr>
-        <w:t xml:space="preserve">Quels sont tes projets pour ce week-end ?</w:t>
+        <w:t>Quels sont vos projets pour ce week-end ?</w:t>
       </w:r>
     </w:p>
     <w:p>
@@ -563,7 +563,7 @@
           <w:b/>
           <w:bCs/>
         </w:rPr>
-        <w:t xml:space="preserve">Penses-tu que la ponctualité et la gestion du temps soient importantes pour toi ?</w:t>
+        <w:t>Pensez-vous que la ponctualité et la gestion du temps soient importantes pour vous ?</w:t>
       </w:r>
     </w:p>
     <w:p>
@@ -642,7 +642,7 @@
           <w:b/>
           <w:bCs/>
         </w:rPr>
-        <w:t xml:space="preserve">Manges-tu mieux à l’école ou à la maison ?</w:t>
+        <w:t>Mangez-vous mieux à l’école ou à la maison ?</w:t>
       </w:r>
     </w:p>
     <w:p>
@@ -725,7 +725,7 @@
           <w:b/>
           <w:bCs/>
         </w:rPr>
-        <w:t xml:space="preserve">Décris ton repas préféré</w:t>
+        <w:t>Décrivez votre repas préféré</w:t>
       </w:r>
     </w:p>
     <w:p>
@@ -808,7 +808,7 @@
           <w:b/>
           <w:bCs/>
         </w:rPr>
-        <w:t xml:space="preserve">Quel est ton type de cuisine préféré et pourquoi ?</w:t>
+        <w:t>Quel est votre type de cuisine préféré et pourquoi ?</w:t>
       </w:r>
     </w:p>
     <w:p>
@@ -891,7 +891,7 @@
           <w:b/>
           <w:bCs/>
         </w:rPr>
-        <w:t xml:space="preserve">Décris une expérience dans un restaurant français avec un menu à trois plats</w:t>
+        <w:t>Décrivez une expérience dans un restaurant français avec un menu à trois plats</w:t>
       </w:r>
     </w:p>
     <w:p>
@@ -974,7 +974,7 @@
           <w:b/>
           <w:bCs/>
         </w:rPr>
-        <w:t xml:space="preserve">Parle des éléments manquants sur une table de restaurant ou de ce que tu pourrais demander</w:t>
+        <w:t>Parlez des éléments manquants sur une table de restaurant ou de ce que vous pourriez demander</w:t>
       </w:r>
     </w:p>
     <w:p>
@@ -1057,7 +1057,7 @@
           <w:b/>
           <w:bCs/>
         </w:rPr>
-        <w:t xml:space="preserve">Discute de l’importance d’essayer de manger sainement et si cela est important pour toi</w:t>
+        <w:t>Discutez de l’importance d’essayer de manger sainement et si cela est important pour vous</w:t>
       </w:r>
     </w:p>
     <w:p>
@@ -1140,7 +1140,7 @@
           <w:b/>
           <w:bCs/>
         </w:rPr>
-        <w:t xml:space="preserve">Fais une liste de différents types de nourriture/boissons (snacks, petits-déjeuners, pique-niques, etc.)</w:t>
+        <w:t>Faites une liste de différents types de nourriture/boissons (snacks, petits-déjeuners, pique-niques, etc.)</w:t>
       </w:r>
     </w:p>
     <w:p>
@@ -1223,7 +1223,7 @@
           <w:b/>
           <w:bCs/>
         </w:rPr>
-        <w:t xml:space="preserve">Parle des courses hebdomadaires ou des courses en ligne avec livraison à domicile</w:t>
+        <w:t>Parlez des courses hebdomadaires ou des courses en ligne avec livraison à domicile</w:t>
       </w:r>
     </w:p>
     <w:p>
@@ -1306,7 +1306,7 @@
           <w:b/>
           <w:bCs/>
         </w:rPr>
-        <w:t xml:space="preserve">Compare les avantages et les inconvénients de manger au réfectoire de l’école avec ceux de manger dans les maisons d’internat</w:t>
+        <w:t>Comparez les avantages et les inconvénients de manger au réfectoire de l’école avec ceux de manger dans les maisons d’internat</w:t>
       </w:r>
     </w:p>
     <w:p>
@@ -1398,7 +1398,7 @@
           <w:b/>
           <w:bCs/>
         </w:rPr>
-        <w:t xml:space="preserve">Liste les douleurs, maux et affections courants de tous les jours</w:t>
+        <w:t>Listez les douleurs, maux et affections courants de tous les jours</w:t>
       </w:r>
     </w:p>
     <w:p>
@@ -1481,7 +1481,7 @@
           <w:b/>
           <w:bCs/>
         </w:rPr>
-        <w:t xml:space="preserve">Décris les symptômes courants des maladies</w:t>
+        <w:t>Décrivez les symptômes courants des maladies</w:t>
       </w:r>
     </w:p>
     <w:p>
@@ -1564,7 +1564,7 @@
           <w:b/>
           <w:bCs/>
         </w:rPr>
-        <w:t xml:space="preserve">Parle d’acheter des remèdes courants ou des articles à la pharmacie</w:t>
+        <w:t>Parlez d’acheter des remèdes courants ou des articles à la pharmacie</w:t>
       </w:r>
     </w:p>
     <w:p>
@@ -1647,7 +1647,7 @@
           <w:b/>
           <w:bCs/>
         </w:rPr>
-        <w:t xml:space="preserve">Parle de quelques blessures mineures que tu as eues et comment elles sont arrivées</w:t>
+        <w:t>Parlez de quelques blessures mineures que vous avez eues et comment elles sont arrivées</w:t>
       </w:r>
     </w:p>
     <w:p>
@@ -1730,7 +1730,7 @@
           <w:b/>
           <w:bCs/>
         </w:rPr>
-        <w:t xml:space="preserve">Dis comment tu restes en forme et en bonne santé, et si c’est important pour toi</w:t>
+        <w:t>Dites comment vous restez en forme et en bonne santé, et si c’est important pour vous</w:t>
       </w:r>
     </w:p>
     <w:p>
@@ -1813,7 +1813,7 @@
           <w:b/>
           <w:bCs/>
         </w:rPr>
-        <w:t xml:space="preserve">Parle de ce qu’il faut éviter pour être en bonne santé</w:t>
+        <w:t>Parlez de ce qu’il faut éviter pour être en bonne santé</w:t>
       </w:r>
     </w:p>
     <w:p>
@@ -1896,7 +1896,7 @@
           <w:b/>
           <w:bCs/>
         </w:rPr>
-        <w:t xml:space="preserve">Parle d’avoir aidé quelqu’un qui est tombé malade ou qui s’est blessé</w:t>
+        <w:t>Parlez d’avoir aidé quelqu’un qui est tombé malade ou qui s’est blessé</w:t>
       </w:r>
     </w:p>
     <w:p>
@@ -1979,7 +1979,7 @@
           <w:b/>
           <w:bCs/>
         </w:rPr>
-        <w:t xml:space="preserve">Donne ton avis sur le tabagisme</w:t>
+        <w:t>Donnez votre avis sur le tabagisme</w:t>
       </w:r>
     </w:p>
     <w:p>
@@ -2071,7 +2071,7 @@
           <w:b/>
           <w:bCs/>
         </w:rPr>
-        <w:t xml:space="preserve">Compare les avantages et inconvénients des différents moyens de transport</w:t>
+        <w:t>Comparez les avantages et inconvénients des différents moyens de transport</w:t>
       </w:r>
     </w:p>
     <w:p>
@@ -2154,7 +2154,7 @@
           <w:b/>
           <w:bCs/>
         </w:rPr>
-        <w:t xml:space="preserve">Décris un voyage compliqué ou difficile</w:t>
+        <w:t>Décrivez un voyage compliqué ou difficile</w:t>
       </w:r>
     </w:p>
     <w:p>
@@ -2224,7 +2224,7 @@
           <w:b/>
           <w:bCs/>
         </w:rPr>
-        <w:t xml:space="preserve">Décris comment ta famille a voyagé à l’étranger une année pour partir en vacances</w:t>
+        <w:t>Décrivez comment votre famille a voyagé à l’étranger une année pour partir en vacances</w:t>
       </w:r>
     </w:p>
     <w:p>
@@ -2307,7 +2307,7 @@
           <w:b/>
           <w:bCs/>
         </w:rPr>
-        <w:t xml:space="preserve">Discute des trajets domicile-travail que doivent faire tes parents/frères et sœurs</w:t>
+        <w:t>Discutez des trajets domicile-travail que doivent faire vos parents/frères et sœurs</w:t>
       </w:r>
     </w:p>
     <w:p>
@@ -2377,7 +2377,7 @@
           <w:b/>
           <w:bCs/>
         </w:rPr>
-        <w:t xml:space="preserve">Parle des avantages et des inconvénients d’utiliser les transports en commun</w:t>
+        <w:t>Parlez des avantages et des inconvénients d’utiliser les transports en commun</w:t>
       </w:r>
     </w:p>
     <w:p>
@@ -2543,7 +2543,7 @@
           <w:b/>
           <w:bCs/>
         </w:rPr>
-        <w:t xml:space="preserve">Parle de la dernière fois que tu as pris l’avion</w:t>
+        <w:t>Parlez de la dernière fois que vous avez pris l’avion</w:t>
       </w:r>
     </w:p>
     <w:p>
@@ -2613,7 +2613,7 @@
           <w:b/>
           <w:bCs/>
         </w:rPr>
-        <w:t xml:space="preserve">Parle de la dernière fois que tu as pris un taxi</w:t>
+        <w:t>Parlez de la dernière fois que vous avez pris un taxi</w:t>
       </w:r>
     </w:p>
     <w:p>
@@ -2683,7 +2683,7 @@
           <w:b/>
           <w:bCs/>
         </w:rPr>
-        <w:t xml:space="preserve">Préférerais-tu prendre l'Eurostar ou l'avion pour aller de Londres à Paris ?</w:t>
+        <w:t>Préféreriez-vous prendre l'Eurostar ou l'avion pour aller de Londres à Paris ?</w:t>
       </w:r>
     </w:p>
     <w:p>
@@ -2775,7 +2775,7 @@
           <w:b/>
           <w:bCs/>
         </w:rPr>
-        <w:t xml:space="preserve">Décris tes amis et ta famille physiquement</w:t>
+        <w:t>Décrivez vos amis et votre famille physiquement</w:t>
       </w:r>
     </w:p>
     <w:p>
@@ -2858,7 +2858,7 @@
           <w:b/>
           <w:bCs/>
         </w:rPr>
-        <w:t xml:space="preserve">Décris le caractère des personnes que tu connais</w:t>
+        <w:t>Décrivez le caractère des personnes que vous connaissez</w:t>
       </w:r>
     </w:p>
     <w:p>
@@ -2941,7 +2941,7 @@
           <w:b/>
           <w:bCs/>
         </w:rPr>
-        <w:t xml:space="preserve">Explique en quoi tu es similaire ou différent de ton père/un ami</w:t>
+        <w:t>Expliquez en quoi vous êtes similaire ou différent de votre père/un ami</w:t>
       </w:r>
     </w:p>
     <w:p>
@@ -3024,7 +3024,7 @@
           <w:b/>
           <w:bCs/>
         </w:rPr>
-        <w:t xml:space="preserve">Discute de tes relations avec les gens et des disputes occasionnelles</w:t>
+        <w:t>Discutez de vos relations avec les gens et des disputes occasionnelles</w:t>
       </w:r>
     </w:p>
     <w:p>
@@ -3107,7 +3107,7 @@
           <w:b/>
           <w:bCs/>
         </w:rPr>
-        <w:t xml:space="preserve">Parle des invitations aux événements sociaux, les donner et les recevoir</w:t>
+        <w:t>Parlez des invitations aux événements sociaux, les donner et les recevoir</w:t>
       </w:r>
     </w:p>
     <w:p>
@@ -3190,7 +3190,7 @@
           <w:b/>
           <w:bCs/>
         </w:rPr>
-        <w:t xml:space="preserve">Décris une fois où des invités sont venus séjourner ou dîner</w:t>
+        <w:t>Décrivez une fois où des invités sont venus séjourner ou dîner</w:t>
       </w:r>
     </w:p>
     <w:p>
@@ -3273,7 +3273,7 @@
           <w:b/>
           <w:bCs/>
         </w:rPr>
-        <w:t xml:space="preserve">Discute des occasions spéciales et comment elles sont célébrées dans ta famille</w:t>
+        <w:t>Discutez des occasions spéciales et comment elles sont célébrées dans votre famille</w:t>
       </w:r>
     </w:p>
     <w:p>
@@ -3356,7 +3356,7 @@
           <w:b/>
           <w:bCs/>
         </w:rPr>
-        <w:t xml:space="preserve">Décris un Noël typique dans ta famille</w:t>
+        <w:t>Décrivez un Noël typique dans votre famille</w:t>
       </w:r>
     </w:p>
     <w:p>
@@ -3439,7 +3439,7 @@
           <w:b/>
           <w:bCs/>
         </w:rPr>
-        <w:t xml:space="preserve">Décris une fête chez un ami et comment c’était</w:t>
+        <w:t>Décrivez une fête chez un ami et comment c’était</w:t>
       </w:r>
     </w:p>
     <w:p>
@@ -3522,7 +3522,7 @@
           <w:b/>
           <w:bCs/>
         </w:rPr>
-        <w:t xml:space="preserve">Dis si avoir de bons amis est important ou non et pourquoi</w:t>
+        <w:t>Dites si avoir de bons amis est important ou non et pourquoi</w:t>
       </w:r>
     </w:p>
     <w:p>
@@ -3614,7 +3614,7 @@
           <w:b/>
           <w:bCs/>
         </w:rPr>
-        <w:t xml:space="preserve">Décris les pièces de ta maison et dis à quoi elles servent</w:t>
+        <w:t>Décrivez les pièces de votre maison et dites à quoi elles servent</w:t>
       </w:r>
     </w:p>
     <w:p>
@@ -3710,7 +3710,7 @@
           <w:b/>
           <w:bCs/>
         </w:rPr>
-        <w:t xml:space="preserve">Parle de l’importance d’avoir sa propre chambre</w:t>
+        <w:t>Parlez de l’importance d’avoir sa propre chambre</w:t>
       </w:r>
     </w:p>
     <w:p>
@@ -3793,7 +3793,7 @@
           <w:b/>
           <w:bCs/>
         </w:rPr>
-        <w:t xml:space="preserve">Explique comment tu as personnalisé ta chambre</w:t>
+        <w:t>Expliquez comment vous avez personnalisé votre chambre</w:t>
       </w:r>
     </w:p>
     <w:p>
@@ -3876,7 +3876,7 @@
           <w:b/>
           <w:bCs/>
         </w:rPr>
-        <w:t xml:space="preserve">Décris des meubles et leur position dans différentes pièces</w:t>
+        <w:t>Décrivez des meubles et leur position dans différentes pièces</w:t>
       </w:r>
     </w:p>
     <w:p>
@@ -3959,7 +3959,7 @@
           <w:b/>
           <w:bCs/>
         </w:rPr>
-        <w:t xml:space="preserve">Parle de la taille de ton jardin et de la fréquence à laquelle il est utilisé</w:t>
+        <w:t>Parlez de la taille de votre jardin et de la fréquence à laquelle il est utilisé</w:t>
       </w:r>
     </w:p>
     <w:p>
@@ -4042,7 +4042,7 @@
           <w:b/>
           <w:bCs/>
         </w:rPr>
-        <w:t xml:space="preserve">Commente les appareils ménagers : sont-ils utiles, neufs, démodés ?</w:t>
+        <w:t>Commentez les appareils ménagers : sont-ils utiles, neufs, démodés ?</w:t>
       </w:r>
     </w:p>
     <w:p>
@@ -4125,7 +4125,7 @@
           <w:b/>
           <w:bCs/>
         </w:rPr>
-        <w:t xml:space="preserve">Parle des tâches ménagères et de l’aide à la maison</w:t>
+        <w:t>Parlez des tâches ménagères et de l’aide à la maison</w:t>
       </w:r>
     </w:p>
     <w:p>
@@ -4208,7 +4208,7 @@
           <w:b/>
           <w:bCs/>
         </w:rPr>
-        <w:t xml:space="preserve">Parle de la dernière fois que tu as fait des corvées à la maison</w:t>
+        <w:t>Parlez de la dernière fois que vous avez fait des corvées à la maison</w:t>
       </w:r>
     </w:p>
     <w:p>
@@ -4278,7 +4278,7 @@
           <w:b/>
           <w:bCs/>
         </w:rPr>
-        <w:t xml:space="preserve">Décris le type de maison dans laquelle tu aimerais vivre plus tard</w:t>
+        <w:t>Décrivez le type de maison dans laquelle vous aimeriez vivre plus tard</w:t>
       </w:r>
     </w:p>
     <w:p>
@@ -4536,7 +4536,7 @@
           <w:b/>
           <w:bCs/>
         </w:rPr>
-        <w:t xml:space="preserve">Décrire comment tu redécorerais ta chambre si tu en avais l’occasion</w:t>
+        <w:t>Décrire comment vous redécoreriez votre chambre si vous en aviez l’occasion</w:t>
       </w:r>
     </w:p>
     <w:p>
@@ -4628,7 +4628,7 @@
           <w:b/>
           <w:bCs/>
         </w:rPr>
-        <w:t xml:space="preserve">Décris des vêtements que tu possèdes en détail, tissu, style (adolescent garçon)</w:t>
+        <w:t>Décrivez des vêtements que vous possédez en détail, tissu, style (adolescent garçon)</w:t>
       </w:r>
     </w:p>
     <w:p>
@@ -4711,7 +4711,7 @@
           <w:b/>
           <w:bCs/>
         </w:rPr>
-        <w:t xml:space="preserve">Décris les différents types de vêtements que tu portes lors d’une journée scolaire et pour quoi faire</w:t>
+        <w:t>Décrivez les différents types de vêtements que vous portez lors d’une journée scolaire et pour quoi faire</w:t>
       </w:r>
     </w:p>
     <w:p>
@@ -4768,7 +4768,7 @@
           <w:b/>
           <w:bCs/>
         </w:rPr>
-        <w:t xml:space="preserve">Décris ce que tu mettrais dans ta valise pour différents types de vacances</w:t>
+        <w:t>Décrivez ce que vous mettriez dans votre valise pour différents types de vacances</w:t>
       </w:r>
     </w:p>
     <w:p>
@@ -4825,7 +4825,7 @@
           <w:b/>
           <w:bCs/>
         </w:rPr>
-        <w:t xml:space="preserve">Parle d’un objet que tu as perdu et qui t’a causé des désagréments, et décris-le</w:t>
+        <w:t>Parlez d’un objet que vous avez perdu et qui vous a causé des désagréments, et décrivez-le</w:t>
       </w:r>
     </w:p>
     <w:p>
@@ -4882,7 +4882,7 @@
           <w:b/>
           <w:bCs/>
         </w:rPr>
-        <w:t xml:space="preserve">Parle d’une sortie récente pour acheter des vêtements, sélectionner, essayer, échanger</w:t>
+        <w:t>Parlez d’une sortie récente pour acheter des vêtements, sélectionner, essayer, échanger</w:t>
       </w:r>
     </w:p>
     <w:p>
@@ -4952,7 +4952,7 @@
           <w:b/>
           <w:bCs/>
         </w:rPr>
-        <w:t xml:space="preserve">Donne des détails sur de petits cadeaux que tu as reçus et achetés</w:t>
+        <w:t>Donnez des détails sur de petits cadeaux que vous avez reçus et achetés</w:t>
       </w:r>
     </w:p>
     <w:p>
@@ -5009,7 +5009,7 @@
           <w:b/>
           <w:bCs/>
         </w:rPr>
-        <w:t xml:space="preserve">Est-ce que la mode t’intéresse ou non ?</w:t>
+        <w:t>Est-ce que la mode vous intéresse ou non ?</w:t>
       </w:r>
     </w:p>
     <w:p>
@@ -5079,7 +5079,7 @@
           <w:b/>
           <w:bCs/>
         </w:rPr>
-        <w:t xml:space="preserve">Parle du plaisir et de la reconnaissance que tu as ressentis en recevant un cadeau</w:t>
+        <w:t>Parlez du plaisir et de la reconnaissance que vous avez ressentis en recevant un cadeau</w:t>
       </w:r>
     </w:p>
     <w:p>
@@ -5158,7 +5158,7 @@
           <w:b/>
           <w:bCs/>
         </w:rPr>
-        <w:t xml:space="preserve">Explique pourquoi le sport est important pour toi</w:t>
+        <w:t>Expliquez pourquoi le sport est important pour vous</w:t>
       </w:r>
     </w:p>
     <w:p>
@@ -5241,7 +5241,7 @@
           <w:b/>
           <w:bCs/>
         </w:rPr>
-        <w:t xml:space="preserve">Parle de tes entraînements sportifs et d'un match que tu as joué</w:t>
+        <w:t>Parlez de vos entraînements sportifs et d'un match que vous avez joué</w:t>
       </w:r>
     </w:p>
     <w:p>
@@ -5324,7 +5324,7 @@
           <w:b/>
           <w:bCs/>
         </w:rPr>
-        <w:t xml:space="preserve">Explique pourquoi la musique est importante pour toi, et si tu joues d’un instrument</w:t>
+        <w:t>Expliquez pourquoi la musique est importante pour vous, et si vous jouez d’un instrument</w:t>
       </w:r>
     </w:p>
     <w:p>
@@ -5407,7 +5407,7 @@
           <w:b/>
           <w:bCs/>
         </w:rPr>
-        <w:t xml:space="preserve">Décris une activité de loisir récente que tu as appréciée</w:t>
+        <w:t>Décrivez une activité de loisir récente que vous avez appréciée</w:t>
       </w:r>
     </w:p>
     <w:p>
@@ -5490,7 +5490,7 @@
           <w:b/>
           <w:bCs/>
         </w:rPr>
-        <w:t xml:space="preserve">Décris une sortie récente au cinéma en détail</w:t>
+        <w:t>Décrivez une sortie récente au cinéma en détail</w:t>
       </w:r>
     </w:p>
     <w:p>
@@ -5573,7 +5573,7 @@
           <w:b/>
           <w:bCs/>
         </w:rPr>
-        <w:t xml:space="preserve">Décris une sortie mémorable au restaurant</w:t>
+        <w:t>Décrivez une sortie mémorable au restaurant</w:t>
       </w:r>
     </w:p>
     <w:p>
@@ -5656,7 +5656,7 @@
           <w:b/>
           <w:bCs/>
         </w:rPr>
-        <w:t xml:space="preserve">Parle de la façon dont tu aimes te détendre à la maison</w:t>
+        <w:t>Parlez de la façon dont vous aimez vous détendre à la maison</w:t>
       </w:r>
     </w:p>
     <w:p>
@@ -5739,7 +5739,7 @@
           <w:b/>
           <w:bCs/>
         </w:rPr>
-        <w:t xml:space="preserve">Décris la visite de personnes chez toi pour un repas ou un court séjour</w:t>
+        <w:t>Décrivez la visite de personnes chez vous pour un repas ou un court séjour</w:t>
       </w:r>
     </w:p>
     <w:p>
@@ -5822,7 +5822,7 @@
           <w:b/>
           <w:bCs/>
         </w:rPr>
-        <w:t xml:space="preserve">Décris une fête récente et dis comment ça s’est passé et pourquoi</w:t>
+        <w:t>Décrivez une fête récente et dites comment ça s’est passé et pourquoi</w:t>
       </w:r>
     </w:p>
     <w:p>
@@ -5914,7 +5914,7 @@
           <w:b/>
           <w:bCs/>
         </w:rPr>
-        <w:t xml:space="preserve">Dis où tu habites en donnant des détails géographiques précis, avec référence à Londres (choisir Windsor)</w:t>
+        <w:t>Dites où vous habitez en donnant des détails géographiques précis, avec référence à Londres (choisir Windsor)</w:t>
       </w:r>
     </w:p>
     <w:p>
@@ -5997,7 +5997,7 @@
           <w:b/>
           <w:bCs/>
         </w:rPr>
-        <w:t xml:space="preserve">Dis quelle est ta nationalité et celle des membres de ta famille (moitié anglais moitié français)</w:t>
+        <w:t>Dites quelle est votre nationalité et celle des membres de votre famille (moitié anglais moitié français)</w:t>
       </w:r>
     </w:p>
     <w:p>
@@ -6080,7 +6080,7 @@
           <w:b/>
           <w:bCs/>
         </w:rPr>
-        <w:t xml:space="preserve">Décris tes destinations de vacances préférées</w:t>
+        <w:t>Décrivez vos destinations de vacances préférées</w:t>
       </w:r>
     </w:p>
     <w:p>
@@ -6163,7 +6163,7 @@
           <w:b/>
           <w:bCs/>
         </w:rPr>
-        <w:t xml:space="preserve">Donne des détails sur des vacances idéales</w:t>
+        <w:t>Donnez des détails sur des vacances idéales</w:t>
       </w:r>
     </w:p>
     <w:p>
@@ -6246,7 +6246,7 @@
           <w:b/>
           <w:bCs/>
         </w:rPr>
-        <w:t xml:space="preserve">Parle d’un voyage à l’étranger décevant ou difficile</w:t>
+        <w:t>Parlez d’un voyage à l’étranger décevant ou difficile</w:t>
       </w:r>
     </w:p>
     <w:p>
@@ -6329,7 +6329,7 @@
           <w:b/>
           <w:bCs/>
         </w:rPr>
-        <w:t xml:space="preserve">Parle de la visite à des personnes que tu connais et qui vivent loin, peut-être à l’étranger</w:t>
+        <w:t>Parlez de la visite à des personnes que vous connaissez et qui vivent loin, peut-être à l’étranger</w:t>
       </w:r>
     </w:p>
     <w:p>
@@ -6412,7 +6412,7 @@
           <w:b/>
           <w:bCs/>
         </w:rPr>
-        <w:t xml:space="preserve">Explique pourquoi visiter de nouveaux pays peut être enrichissant</w:t>
+        <w:t>Expliquez pourquoi visiter de nouveaux pays peut être enrichissant</w:t>
       </w:r>
     </w:p>
     <w:p>
@@ -6504,7 +6504,7 @@
           <w:b/>
           <w:bCs/>
         </w:rPr>
-        <w:t xml:space="preserve">Liste d’exemples de problèmes environnementaux</w:t>
+        <w:t>Listez d’exemples de problèmes environnementaux</w:t>
       </w:r>
     </w:p>
     <w:p>
@@ -6587,7 +6587,7 @@
           <w:b/>
           <w:bCs/>
         </w:rPr>
-        <w:t xml:space="preserve">Dis ce que tu fais régulièrement pour aider l’environnement</w:t>
+        <w:t>Dites ce que vous faites régulièrement pour aider l’environnement</w:t>
       </w:r>
     </w:p>
     <w:p>
@@ -6670,7 +6670,7 @@
           <w:b/>
           <w:bCs/>
         </w:rPr>
-        <w:t xml:space="preserve">Dis ce que les gens doivent faire plus/moins pour aider l’environnement</w:t>
+        <w:t>Dites ce que les gens doivent faire plus/moins pour aider l’environnement</w:t>
       </w:r>
     </w:p>
     <w:p>
@@ -6753,7 +6753,7 @@
           <w:b/>
           <w:bCs/>
         </w:rPr>
-        <w:t xml:space="preserve">Décris le temps qu’il a fait pendant tes vacances</w:t>
+        <w:t>Décrivez le temps qu’il a fait pendant vos vacances</w:t>
       </w:r>
     </w:p>
     <w:p>
@@ -6836,7 +6836,7 @@
           <w:b/>
           <w:bCs/>
         </w:rPr>
-        <w:t xml:space="preserve">Parle du mauvais temps qui a gâché des plans</w:t>
+        <w:t>Parlez du mauvais temps qui a gâché des plans</w:t>
       </w:r>
     </w:p>
     <w:p>
@@ -6919,7 +6919,7 @@
           <w:b/>
           <w:bCs/>
         </w:rPr>
-        <w:t xml:space="preserve">Discute des activités possibles selon différents scénarios météo</w:t>
+        <w:t>Discutez des activités possibles selon différents scénarios météo</w:t>
       </w:r>
     </w:p>
     <w:p>
@@ -7002,7 +7002,7 @@
           <w:b/>
           <w:bCs/>
         </w:rPr>
-        <w:t xml:space="preserve">Parle des avantages et inconvénients des différentes saisons et des activités adaptées</w:t>
+        <w:t>Parlez des avantages et inconvénients des différentes saisons et des activités adaptées</w:t>
       </w:r>
     </w:p>
     <w:p>
@@ -7120,7 +7120,7 @@
           <w:b/>
           <w:bCs/>
         </w:rPr>
-        <w:t xml:space="preserve">Décris les avantages et inconvénients des iPads à l'école</w:t>
+        <w:t>Décrivez les avantages et inconvénients des iPads à l'école</w:t>
       </w:r>
     </w:p>
     <w:p>
@@ -7203,7 +7203,7 @@
           <w:b/>
           <w:bCs/>
         </w:rPr>
-        <w:t xml:space="preserve">Parle des avantages et inconvénients des Kindles</w:t>
+        <w:t>Parlez des avantages et inconvénients des Kindles</w:t>
       </w:r>
     </w:p>
     <w:p>
@@ -7286,7 +7286,7 @@
           <w:b/>
           <w:bCs/>
         </w:rPr>
-        <w:t xml:space="preserve">Pourquoi es-tu allé à la poste la dernière fois ?</w:t>
+        <w:t>Pourquoi êtes-vous allé à la poste la dernière fois ?</w:t>
       </w:r>
     </w:p>
     <w:p>
@@ -7356,7 +7356,7 @@
           <w:b/>
           <w:bCs/>
         </w:rPr>
-        <w:t xml:space="preserve">Compare les avantages et inconvénients de l’argent liquide et des alternatives</w:t>
+        <w:t>Comparez les avantages et inconvénients de l’argent liquide et des alternatives</w:t>
       </w:r>
     </w:p>
     <w:p>
@@ -7439,7 +7439,7 @@
           <w:b/>
           <w:bCs/>
         </w:rPr>
-        <w:t xml:space="preserve">Parle de ton usage d'Internet et mentionne les avantages et inconvénients</w:t>
+        <w:t>Parlez de votre usage d'Internet et mentionnez les avantages et inconvénients</w:t>
       </w:r>
     </w:p>
     <w:p>
@@ -7509,7 +7509,7 @@
           <w:b/>
           <w:bCs/>
         </w:rPr>
-        <w:t xml:space="preserve">Discute des avantages et inconvénients du shopping en ligne</w:t>
+        <w:t>Discutez des avantages et inconvénients du shopping en ligne</w:t>
       </w:r>
     </w:p>
     <w:p>
@@ -7592,7 +7592,7 @@
           <w:b/>
           <w:bCs/>
         </w:rPr>
-        <w:t xml:space="preserve">Décris une fois où un téléphone portable a été essentiel</w:t>
+        <w:t>Décrivez une fois où un téléphone portable a été essentiel</w:t>
       </w:r>
     </w:p>
     <w:p>
@@ -7662,7 +7662,7 @@
           <w:b/>
           <w:bCs/>
         </w:rPr>
-        <w:t xml:space="preserve">Discute des avantages et inconvénients des réseaux sociaux</w:t>
+        <w:t>Discutez des avantages et inconvénients des réseaux sociaux</w:t>
       </w:r>
     </w:p>
     <w:p>
@@ -7745,7 +7745,7 @@
           <w:b/>
           <w:bCs/>
         </w:rPr>
-        <w:t xml:space="preserve">Parle des avantages et inconvénients de SKYPE et Zoom pour rester en contact</w:t>
+        <w:t>Parlez des avantages et inconvénients de SKYPE et Zoom pour rester en contact</w:t>
       </w:r>
     </w:p>
     <w:p>
@@ -7815,7 +7815,7 @@
           <w:b/>
           <w:bCs/>
         </w:rPr>
-        <w:t xml:space="preserve">Imagine quelle nouvelle technologie pourrait exister dans 20 ans</w:t>
+        <w:t>Imaginez quelle nouvelle technologie pourrait exister dans 20 ans</w:t>
       </w:r>
     </w:p>
     <w:p>
@@ -7907,7 +7907,7 @@
           <w:b/>
           <w:bCs/>
         </w:rPr>
-        <w:t xml:space="preserve">Décris les bâtiments et les installations dans ta région (Londres)</w:t>
+        <w:t>Décrivez les bâtiments et les installations dans votre région (Londres)</w:t>
       </w:r>
     </w:p>
     <w:p>
@@ -7990,7 +7990,7 @@
           <w:b/>
           <w:bCs/>
         </w:rPr>
-        <w:t xml:space="preserve">Donne des détails sur pourquoi tu aimes ou n’aimes pas ta ville natale</w:t>
+        <w:t>Donnez des détails sur pourquoi vous aimez ou n’aimez pas votre ville natale</w:t>
       </w:r>
     </w:p>
     <w:p>
@@ -8073,7 +8073,7 @@
           <w:b/>
           <w:bCs/>
         </w:rPr>
-        <w:t xml:space="preserve">Qu’y a-t-il pour les jeunes dans ta région ?</w:t>
+        <w:t>Qu’y a-t-il pour les jeunes dans votre région ?</w:t>
       </w:r>
     </w:p>
     <w:p>
@@ -8156,7 +8156,7 @@
           <w:b/>
           <w:bCs/>
         </w:rPr>
-        <w:t xml:space="preserve">Décris ta boutique locale et ton restaurant préféré</w:t>
+        <w:t>Décrivez votre boutique locale et votre restaurant préféré</w:t>
       </w:r>
     </w:p>
     <w:p>
@@ -8322,7 +8322,7 @@
           <w:b/>
           <w:bCs/>
         </w:rPr>
-        <w:t xml:space="preserve">Discute des avantages et des inconvénients de vivre en ville ou à la campagne</w:t>
+        <w:t>Discutez des avantages et des inconvénients de vivre en ville ou à la campagne</w:t>
       </w:r>
     </w:p>
     <w:p>
@@ -8405,7 +8405,7 @@
           <w:b/>
           <w:bCs/>
         </w:rPr>
-        <w:t xml:space="preserve">Explique pourquoi certaines personnes veulent prendre leur retraite à la campagne</w:t>
+        <w:t>Expliquez pourquoi certaines personnes veulent prendre leur retraite à la campagne</w:t>
       </w:r>
     </w:p>
     <w:p>
@@ -8488,7 +8488,7 @@
           <w:b/>
           <w:bCs/>
         </w:rPr>
-        <w:t xml:space="preserve">Explique pourquoi tu penses que les maisons sont plus chères en ville</w:t>
+        <w:t>Expliquez pourquoi vous pensez que les maisons sont plus chères en ville</w:t>
       </w:r>
     </w:p>
     <w:p>
@@ -8580,7 +8580,7 @@
           <w:b/>
           <w:bCs/>
         </w:rPr>
-        <w:t xml:space="preserve">Parle de faire du shopping pour des vêtements et des chaussures en détail</w:t>
+        <w:t>Parlez de faire du shopping pour des vêtements et des chaussures en détail</w:t>
       </w:r>
     </w:p>
     <w:p>
@@ -8650,7 +8650,7 @@
           <w:b/>
           <w:bCs/>
         </w:rPr>
-        <w:t xml:space="preserve">Parle d’essayer des vêtements et du besoin de différentes tailles</w:t>
+        <w:t>Parlez d’essayer des vêtements et du besoin de différentes tailles</w:t>
       </w:r>
     </w:p>
     <w:p>
@@ -8982,7 +8982,7 @@
           <w:b/>
           <w:bCs/>
         </w:rPr>
-        <w:t xml:space="preserve">Parle de la taille de certains bâtiments ou pièces et donne des mesures approximatives</w:t>
+        <w:t>Parlez de la taille de certains bâtiments ou pièces et donnez des mesures approximatives</w:t>
       </w:r>
     </w:p>
     <w:p>
@@ -9074,7 +9074,7 @@
           <w:b/>
           <w:bCs/>
         </w:rPr>
-        <w:t xml:space="preserve">Mentionne différents objets dans ta maison et dis de quoi ils sont faits</w:t>
+        <w:t>Mentionnez différents objets dans votre maison et dites de quoi ils sont faits</w:t>
       </w:r>
     </w:p>
     <w:p>
@@ -9157,7 +9157,7 @@
           <w:b/>
           <w:bCs/>
         </w:rPr>
-        <w:t xml:space="preserve">Parle de différents cadeaux que tu pourrais acheter en disant de quoi ils sont faits</w:t>
+        <w:t>Parlez de différents cadeaux que vous pourriez acheter en disant de quoi ils sont faits</w:t>
       </w:r>
     </w:p>
     <w:p>
@@ -9240,7 +9240,7 @@
           <w:b/>
           <w:bCs/>
         </w:rPr>
-        <w:t xml:space="preserve">Décris le matériau de différents articles de vêtements/accessoires</w:t>
+        <w:t>Décrivez le matériau de différents articles de vêtements/accessoires</w:t>
       </w:r>
     </w:p>
     <w:p>
@@ -9323,7 +9323,7 @@
           <w:b/>
           <w:bCs/>
         </w:rPr>
-        <w:t xml:space="preserve">Discute des avantages et inconvénients du plastique</w:t>
+        <w:t>Discutez des avantages et inconvénients du plastique</w:t>
       </w:r>
     </w:p>
     <w:p>
@@ -9406,7 +9406,7 @@
           <w:b/>
           <w:bCs/>
         </w:rPr>
-        <w:t xml:space="preserve">Discute des avantages et inconvénients du passage au zéro papier</w:t>
+        <w:t>Discutez des avantages et inconvénients du passage au zéro papier</w:t>
       </w:r>
     </w:p>
     <w:p>
@@ -9498,7 +9498,7 @@
           <w:b/>
           <w:bCs/>
         </w:rPr>
-        <w:t xml:space="preserve">Décris ton école</w:t>
+        <w:t>Décrivez votre école</w:t>
       </w:r>
     </w:p>
     <w:p>
@@ -9568,7 +9568,7 @@
           <w:b/>
           <w:bCs/>
         </w:rPr>
-        <w:t xml:space="preserve">Donne ton avis sur différentes matières et professeurs</w:t>
+        <w:t>Donnez votre avis sur différentes matières et professeurs</w:t>
       </w:r>
     </w:p>
     <w:p>
@@ -9638,7 +9638,7 @@
           <w:b/>
           <w:bCs/>
         </w:rPr>
-        <w:t xml:space="preserve">Décris et discute ton uniforme</w:t>
+        <w:t>Décrivez et discutez votre uniforme</w:t>
       </w:r>
     </w:p>
     <w:p>
@@ -9708,7 +9708,7 @@
           <w:b/>
           <w:bCs/>
         </w:rPr>
-        <w:t xml:space="preserve">Fais des comparaisons entre Eton et ton école primaire</w:t>
+        <w:t>Faites des comparaisons entre Eton et votre école primaire</w:t>
       </w:r>
     </w:p>
     <w:p>
@@ -9778,7 +9778,7 @@
           <w:b/>
           <w:bCs/>
         </w:rPr>
-        <w:t xml:space="preserve">Parle des règles et d'une fois où tu as été puni</w:t>
+        <w:t>Parlez des règles et d'une fois où vous avez été puni</w:t>
       </w:r>
     </w:p>
     <w:p>
@@ -9848,7 +9848,7 @@
           <w:b/>
           <w:bCs/>
         </w:rPr>
-        <w:t xml:space="preserve">Parle des récents bulletins scolaires et des examens à venir</w:t>
+        <w:t>Parlez des récents bulletins scolaires et des examens à venir</w:t>
       </w:r>
     </w:p>
     <w:p>
@@ -9918,7 +9918,7 @@
           <w:b/>
           <w:bCs/>
         </w:rPr>
-        <w:t xml:space="preserve">Décris les installations et à quelle fréquence tu les utilises</w:t>
+        <w:t>Décrivez les installations et à quelle fréquence vous les utilisez</w:t>
       </w:r>
     </w:p>
     <w:p>
@@ -9988,7 +9988,7 @@
           <w:b/>
           <w:bCs/>
         </w:rPr>
-        <w:t xml:space="preserve">Parle de tes choix pour le C Block (professeur principal, matières)</w:t>
+        <w:t>Parlez de vos choix pour le C Block (professeur principal, matières)</w:t>
       </w:r>
     </w:p>
     <w:p>
@@ -10058,7 +10058,7 @@
           <w:b/>
           <w:bCs/>
         </w:rPr>
-        <w:t xml:space="preserve">Parle de tes aspirations universitaires</w:t>
+        <w:t>Parlez de vos aspirations universitaires</w:t>
       </w:r>
     </w:p>
     <w:p>
@@ -10128,7 +10128,7 @@
           <w:b/>
           <w:bCs/>
         </w:rPr>
-        <w:t xml:space="preserve">Penses-tu qu'une bonne éducation soit importante ?</w:t>
+        <w:t>Pensez-vous qu'une bonne éducation soit importante ?</w:t>
       </w:r>
     </w:p>
     <w:p>
@@ -10207,7 +10207,7 @@
           <w:b/>
           <w:bCs/>
         </w:rPr>
-        <w:t xml:space="preserve">Décris les carrières de tes parents et comment ils en sont arrivés là</w:t>
+        <w:t>Décrivez les carrières de vos parents et comment ils en sont arrivés là</w:t>
       </w:r>
     </w:p>
     <w:p>
@@ -10264,7 +10264,7 @@
           <w:b/>
           <w:bCs/>
         </w:rPr>
-        <w:t xml:space="preserve">Évalue les avantages et inconvénients du métier d’enseignant</w:t>
+        <w:t>Évaluez les avantages et inconvénients du métier d’enseignant</w:t>
       </w:r>
     </w:p>
     <w:p>
@@ -10308,7 +10308,7 @@
           <w:b/>
           <w:bCs/>
         </w:rPr>
-        <w:t xml:space="preserve">Parle des opportunités de stage que tu as eues ou aimerais avoir</w:t>
+        <w:t>Parlez des opportunités de stage que vous avez eues ou aimerais avoir</w:t>
       </w:r>
     </w:p>
     <w:p>
@@ -10365,7 +10365,7 @@
           <w:b/>
           <w:bCs/>
         </w:rPr>
-        <w:t xml:space="preserve">Explique comment tu reçois/obtiens/gagnes de l’argent de poche</w:t>
+        <w:t>Expliquez comment vous recevez/obtenez/gagnez de l’argent de poche</w:t>
       </w:r>
     </w:p>
     <w:p>
@@ -10422,7 +10422,7 @@
           <w:b/>
           <w:bCs/>
         </w:rPr>
-        <w:t xml:space="preserve">Fais allusion à d'autres choix de carrière possibles</w:t>
+        <w:t>Faites allusion à d'autres choix de carrière possibles</w:t>
       </w:r>
     </w:p>
     <w:p>
@@ -10479,7 +10479,7 @@
           <w:b/>
           <w:bCs/>
         </w:rPr>
-        <w:t xml:space="preserve">Un gros salaire ou un travail gratifiant est-il plus important pour toi ?</w:t>
+        <w:t>Un gros salaire ou un travail gratifiant est-il plus important pour vous ?</w:t>
       </w:r>
     </w:p>
     <w:p>
@@ -10676,7 +10676,7 @@
           <w:b/>
           <w:bCs/>
         </w:rPr>
-        <w:t xml:space="preserve">Est-ce que tu penses que la retraite est quelque chose à attendre avec impatience ?</w:t>
+        <w:t>Est-ce que vous pensez que la retraite est quelque chose à attendre avec impatience ?</w:t>
       </w:r>
     </w:p>
     <w:p>
@@ -10755,7 +10755,7 @@
           <w:b/>
           <w:bCs/>
         </w:rPr>
-        <w:t xml:space="preserve">Dis dans quel pays tu es né, et où sont nés les autres membres de ta famille, s’ils sont différents</w:t>
+        <w:t>Dites dans quel pays vous êtes né, et où sont nés les autres membres de votre famille, s’ils sont différents</w:t>
       </w:r>
     </w:p>
     <w:p>
@@ -10812,7 +10812,7 @@
           <w:b/>
           <w:bCs/>
         </w:rPr>
-        <w:t xml:space="preserve">Parle d’un pays étranger que tu aimes et dis pourquoi</w:t>
+        <w:t>Parlez d’un pays étranger que vous aimez et dites pourquoi</w:t>
       </w:r>
     </w:p>
     <w:p>
@@ -10882,7 +10882,7 @@
           <w:b/>
           <w:bCs/>
         </w:rPr>
-        <w:t xml:space="preserve">Si tu devais vivre à l’étranger, où choisirais-tu et pourquoi ?</w:t>
+        <w:t>Si vous deviez vivre à l’étranger, où choisiriez-vous et pourquoi ?</w:t>
       </w:r>
     </w:p>
     <w:p>
@@ -10939,7 +10939,7 @@
           <w:b/>
           <w:bCs/>
         </w:rPr>
-        <w:t xml:space="preserve">Décris tes impressions lorsque tu as visité un nouveau pays pour la première fois</w:t>
+        <w:t>Décrivez vos impressions lorsque vous avez visité un nouveau pays pour la première fois</w:t>
       </w:r>
     </w:p>
     <w:p>
@@ -11009,7 +11009,7 @@
           <w:b/>
           <w:bCs/>
         </w:rPr>
-        <w:t xml:space="preserve">Parle de différents pays francophones et de leurs personnages célèbres</w:t>
+        <w:t>Parlez de différents pays francophones et de leurs personnages célèbres</w:t>
       </w:r>
     </w:p>
     <w:p>
@@ -11079,7 +11079,7 @@
           <w:b/>
           <w:bCs/>
         </w:rPr>
-        <w:t xml:space="preserve">Parle de nouvelles personnes que tu as rencontrées à l’étranger</w:t>
+        <w:t>Parlez de nouvelles personnes que vous avez rencontrées à l’étranger</w:t>
       </w:r>
     </w:p>
     <w:p>
@@ -11136,7 +11136,7 @@
           <w:b/>
           <w:bCs/>
         </w:rPr>
-        <w:t xml:space="preserve">Parle de ton parcours en apprentissage des langues et de tes compétences</w:t>
+        <w:t>Parlez de votre parcours en apprentissage des langues et de vos compétences</w:t>
       </w:r>
     </w:p>
     <w:p>
@@ -11285,7 +11285,7 @@
           <w:b/>
           <w:bCs/>
         </w:rPr>
-        <w:t xml:space="preserve">Décris Noël l’année dernière et en général (un Noël traditionnel anglais)</w:t>
+        <w:t>Décrivez Noël l’année dernière et en général (un Noël traditionnel anglais)</w:t>
       </w:r>
     </w:p>
     <w:p>
@@ -11368,7 +11368,7 @@
           <w:b/>
           <w:bCs/>
         </w:rPr>
-        <w:t xml:space="preserve">Donne des détails sur des célébrations d'anniversaires passées</w:t>
+        <w:t>Donnez des détails sur des célébrations d'anniversaires passées</w:t>
       </w:r>
     </w:p>
     <w:p>
@@ -11438,7 +11438,7 @@
           <w:b/>
           <w:bCs/>
         </w:rPr>
-        <w:t xml:space="preserve">Décris des occasions et célébrations spéciales françaises</w:t>
+        <w:t>Décrivez des occasions et célébrations spéciales françaises</w:t>
       </w:r>
     </w:p>
     <w:p>
@@ -11508,7 +11508,7 @@
           <w:b/>
           <w:bCs/>
         </w:rPr>
-        <w:t xml:space="preserve">Décris quelques coutumes et traditions françaises</w:t>
+        <w:t>Décrivez quelques coutumes et traditions françaises</w:t>
       </w:r>
     </w:p>
     <w:p>
@@ -11578,7 +11578,7 @@
           <w:b/>
           <w:bCs/>
         </w:rPr>
-        <w:t xml:space="preserve">Fais allusion à ce que tu espères recevoir comme cadeau prochainement</w:t>
+        <w:t>Faites allusion à ce que vous espérez recevoir comme cadeau prochainement</w:t>
       </w:r>
     </w:p>
     <w:p>
@@ -11635,7 +11635,7 @@
           <w:b/>
           <w:bCs/>
         </w:rPr>
-        <w:t xml:space="preserve">Décris ta participation à une occasion spéciale récemment à l’étranger</w:t>
+        <w:t>Décrivez votre participation à une occasion spéciale récemment à l’étranger</w:t>
       </w:r>
     </w:p>
     <w:p>

</xml_diff>